<commit_message>
Update document title to reflect corrections made
Corrected the title of the presentation document to indicate it has been revised.

Replit-Commit-Author: Agent
Replit-Commit-Session-Id: a0afa139-8dbe-4692-b45b-1084131419e4
Replit-Commit-Checkpoint-Type: full_checkpoint
Replit-Commit-Event-Id: 90cbc04e-bc30-4800-99c3-f1920d9c1e05
Replit-Commit-Screenshot-Url: https://storage.googleapis.com/screenshot-production-us-central1/029ad065-2bca-47a2-a9a6-24e27e1841cc/a0afa139-8dbe-4692-b45b-1084131419e4/Y3zrjeS
Replit-Helium-Checkpoint-Created: true
</commit_message>
<xml_diff>
--- a/BKApay_Dossier_Presentation.docx
+++ b/BKApay_Dossier_Presentation.docx
@@ -748,7 +748,20 @@
           <w:color w:val="333333"/>
           <w:sz w:val="21"/>
         </w:rPr>
-        <w:t>Objectif immediat (30 jours) : depasser 100 000 USD de commissions mensuelles, soit environ 5 a 6 milliards XOF traites sur le mois a 6 %. Objectif a moyen terme : atteindre 1 million USD de commission journaliere, representant 50 millions USD de commissions mensuelles et un volume mensuel de 833 millions USD.</w:t>
+        <w:t>Objectif immediat (dans les 30 prochains jours) : depasser 50 000 000 FCFA de commissions de frais de service sur le mois. A 6 % de commission, cela correspond a un volume mensuel de transactions traite d'environ 833 000 000 FCFA. Cet objectif constitue le premier palier de rentabilite visible et reproductible sur l'ensemble des 17 pays couverts.</w:t>
+      </w:r>
+    </w:p>
+    <w:p>
+      <w:pPr>
+        <w:spacing w:after="60"/>
+      </w:pPr>
+      <w:r>
+        <w:rPr>
+          <w:b w:val="0"/>
+          <w:color w:val="333333"/>
+          <w:sz w:val="21"/>
+        </w:rPr>
+        <w:t>Objectif a moyen terme : faire croitre ce chiffre de maniere significative en augmentant le volume par pays grace a l'alimentation des wallets operateurs, aux campagnes marketing ciblees et a l'acquisition de nouveaux marchands et integrateurs API.</w:t>
       </w:r>
     </w:p>
     <w:p>

</xml_diff>

<commit_message>
Update presentation document with final corrections
Regenerate BKApay presentation document with corrected financial projections, commission details, and fee structure.

Replit-Commit-Author: Agent
Replit-Commit-Session-Id: a0afa139-8dbe-4692-b45b-1084131419e4
Replit-Commit-Checkpoint-Type: full_checkpoint
Replit-Commit-Event-Id: a79ba49d-ea07-4856-99d8-df75cd9c9e69
Replit-Commit-Screenshot-Url: https://storage.googleapis.com/screenshot-production-us-central1/029ad065-2bca-47a2-a9a6-24e27e1841cc/a0afa139-8dbe-4692-b45b-1084131419e4/Y3zrjeS
Replit-Helium-Checkpoint-Created: true
</commit_message>
<xml_diff>
--- a/BKApay_Dossier_Presentation.docx
+++ b/BKApay_Dossier_Presentation.docx
@@ -99,14 +99,15 @@
         <w:tblLook w:firstColumn="1" w:firstRow="1" w:lastColumn="0" w:lastRow="0" w:noHBand="0" w:noVBand="1" w:val="04A0"/>
       </w:tblPr>
       <w:tblGrid>
-        <w:gridCol w:w="3135"/>
-        <w:gridCol w:w="3135"/>
-        <w:gridCol w:w="3135"/>
+        <w:gridCol w:w="2351"/>
+        <w:gridCol w:w="2351"/>
+        <w:gridCol w:w="2351"/>
+        <w:gridCol w:w="2351"/>
       </w:tblGrid>
       <w:tr>
         <w:tc>
           <w:tcPr>
-            <w:tcW w:type="dxa" w:w="3135"/>
+            <w:tcW w:type="dxa" w:w="2351"/>
             <w:shd w:val="clear" w:color="auto" w:fill="0A295E"/>
             <w:tcBorders>
               <w:top w:val="nil"/>
@@ -123,7 +124,7 @@
               <w:rPr>
                 <w:b/>
                 <w:color w:val="FFFFFF"/>
-                <w:sz w:val="19"/>
+                <w:sz w:val="18"/>
               </w:rPr>
               <w:t>Utilisateurs inscrits</w:t>
             </w:r>
@@ -131,7 +132,7 @@
         </w:tc>
         <w:tc>
           <w:tcPr>
-            <w:tcW w:type="dxa" w:w="3135"/>
+            <w:tcW w:type="dxa" w:w="2351"/>
             <w:shd w:val="clear" w:color="auto" w:fill="0A295E"/>
             <w:tcBorders>
               <w:top w:val="nil"/>
@@ -148,7 +149,7 @@
               <w:rPr>
                 <w:b/>
                 <w:color w:val="FFFFFF"/>
-                <w:sz w:val="19"/>
+                <w:sz w:val="18"/>
               </w:rPr>
               <w:t>KYC verifies</w:t>
             </w:r>
@@ -156,7 +157,7 @@
         </w:tc>
         <w:tc>
           <w:tcPr>
-            <w:tcW w:type="dxa" w:w="3135"/>
+            <w:tcW w:type="dxa" w:w="2351"/>
             <w:shd w:val="clear" w:color="auto" w:fill="0A295E"/>
             <w:tcBorders>
               <w:top w:val="nil"/>
@@ -173,9 +174,34 @@
               <w:rPr>
                 <w:b/>
                 <w:color w:val="FFFFFF"/>
-                <w:sz w:val="19"/>
+                <w:sz w:val="18"/>
               </w:rPr>
-              <w:t>Volume traite (cumule)</w:t>
+              <w:t>Volume traite (total cumule)</w:t>
+            </w:r>
+          </w:p>
+        </w:tc>
+        <w:tc>
+          <w:tcPr>
+            <w:tcW w:type="dxa" w:w="2351"/>
+            <w:shd w:val="clear" w:color="auto" w:fill="0A295E"/>
+            <w:tcBorders>
+              <w:top w:val="nil"/>
+              <w:left w:val="nil"/>
+              <w:bottom w:val="nil"/>
+              <w:right w:val="nil"/>
+            </w:tcBorders>
+          </w:tcPr>
+          <w:p>
+            <w:pPr>
+              <w:jc w:val="center"/>
+            </w:pPr>
+            <w:r>
+              <w:rPr>
+                <w:b/>
+                <w:color w:val="FFFFFF"/>
+                <w:sz w:val="18"/>
+              </w:rPr>
+              <w:t>Commissions encaissees (cumulees)</w:t>
             </w:r>
           </w:p>
         </w:tc>
@@ -183,7 +209,7 @@
       <w:tr>
         <w:tc>
           <w:tcPr>
-            <w:tcW w:type="dxa" w:w="3135"/>
+            <w:tcW w:type="dxa" w:w="2351"/>
             <w:shd w:val="clear" w:color="auto" w:fill="E8F0FA"/>
             <w:tcBorders>
               <w:top w:val="nil"/>
@@ -200,7 +226,7 @@
               <w:rPr>
                 <w:b/>
                 <w:color w:val="0A295E"/>
-                <w:sz w:val="21"/>
+                <w:sz w:val="20"/>
               </w:rPr>
               <w:t>~600 utilisateurs</w:t>
             </w:r>
@@ -208,7 +234,7 @@
         </w:tc>
         <w:tc>
           <w:tcPr>
-            <w:tcW w:type="dxa" w:w="3135"/>
+            <w:tcW w:type="dxa" w:w="2351"/>
             <w:shd w:val="clear" w:color="auto" w:fill="E8F0FA"/>
             <w:tcBorders>
               <w:top w:val="nil"/>
@@ -225,7 +251,7 @@
               <w:rPr>
                 <w:b/>
                 <w:color w:val="0A295E"/>
-                <w:sz w:val="21"/>
+                <w:sz w:val="20"/>
               </w:rPr>
               <w:t>~60 verifies</w:t>
             </w:r>
@@ -233,7 +259,7 @@
         </w:tc>
         <w:tc>
           <w:tcPr>
-            <w:tcW w:type="dxa" w:w="3135"/>
+            <w:tcW w:type="dxa" w:w="2351"/>
             <w:shd w:val="clear" w:color="auto" w:fill="E8F0FA"/>
             <w:tcBorders>
               <w:top w:val="nil"/>
@@ -250,9 +276,34 @@
               <w:rPr>
                 <w:b/>
                 <w:color w:val="0A295E"/>
-                <w:sz w:val="21"/>
+                <w:sz w:val="20"/>
               </w:rPr>
               <w:t>~20 000 000 XOF</w:t>
+            </w:r>
+          </w:p>
+        </w:tc>
+        <w:tc>
+          <w:tcPr>
+            <w:tcW w:type="dxa" w:w="2351"/>
+            <w:shd w:val="clear" w:color="auto" w:fill="E8F0FA"/>
+            <w:tcBorders>
+              <w:top w:val="nil"/>
+              <w:left w:val="nil"/>
+              <w:bottom w:val="nil"/>
+              <w:right w:val="nil"/>
+            </w:tcBorders>
+          </w:tcPr>
+          <w:p>
+            <w:pPr>
+              <w:jc w:val="center"/>
+            </w:pPr>
+            <w:r>
+              <w:rPr>
+                <w:b/>
+                <w:color w:val="0A295E"/>
+                <w:sz w:val="20"/>
+              </w:rPr>
+              <w:t>~1 200 000 XOF</w:t>
             </w:r>
           </w:p>
         </w:tc>
@@ -260,8 +311,21 @@
     </w:tbl>
     <w:p>
       <w:pPr>
+        <w:spacing w:after="60"/>
+      </w:pPr>
+    </w:p>
+    <w:p>
+      <w:pPr>
         <w:spacing w:after="120"/>
       </w:pPr>
+      <w:r>
+        <w:rPr>
+          <w:i/>
+          <w:color w:val="555555"/>
+          <w:sz w:val="18"/>
+        </w:rPr>
+        <w:t>Note : le volume traite represente le montant total des transactions passees par la plateforme depuis son lancement. Les commissions encaissees correspondent aux frais de service preleves sur ce volume.</w:t>
+      </w:r>
     </w:p>
     <w:p>
       <w:pPr>
@@ -333,7 +397,7 @@
           <w:color w:val="333333"/>
           <w:sz w:val="21"/>
         </w:rPr>
-        <w:t>BKApay centralise l'acces a tous ces operateurs via une API unique, des liens de paiement sans code, un tableau de bord marchand complet et un assistant IA (EMALI) pour piloter les transactions en langage naturel. Frais transparents et uniformes a 6 %. Deploiement immediat dans 17 pays.</w:t>
+        <w:t>BKApay centralise l'acces a tous ces operateurs via une API unique, des liens de paiement sans code, un tableau de bord marchand complet et un assistant IA (EMALI) pour piloter les transactions en langage naturel. Les frais de service sont adaptes par pays et par operateur pour rester competitifs sur chaque marche. Deploiement immediat dans 17 pays.</w:t>
       </w:r>
     </w:p>
     <w:p>
@@ -367,7 +431,7 @@
           <w:color w:val="333333"/>
           <w:sz w:val="21"/>
         </w:rPr>
-        <w:t>BKApay applique une commission de service uniforme de 6 % sur chaque transaction (entrante ou sortante). Cette simplicite tarifaire est un avantage competitif : les marchands comprennent exactement ce qu'ils paient, les developpeurs peuvent modeliser leurs couts sans surprise.</w:t>
+        <w:t>BKApay genere ses revenus via des frais de service appliques a chaque transaction. Ces frais varient selon le pays et l'operateur afin de s'adapter aux conditions locales et aux structures tarifaires des providers de paiement. A titre indicatif, les frais s'elevent typiquement a 6 % pour les paiements entrants et 6 % pour les paiements sortants, mais peuvent etre ajustes par l'administrateur selon les marches.</w:t>
       </w:r>
     </w:p>
     <w:tbl>
@@ -454,7 +518,7 @@
                 <w:color w:val="FFFFFF"/>
                 <w:sz w:val="19"/>
               </w:rPr>
-              <w:t>Commission</w:t>
+              <w:t>Frais indicatifs</w:t>
             </w:r>
           </w:p>
         </w:tc>
@@ -519,7 +583,7 @@
                 <w:color w:val="333333"/>
                 <w:sz w:val="19"/>
               </w:rPr>
-              <w:t>6 % du montant</w:t>
+              <w:t>Variable par pays/operateur (ex. 6 % entrant)</w:t>
             </w:r>
           </w:p>
         </w:tc>
@@ -584,7 +648,7 @@
                 <w:color w:val="333333"/>
                 <w:sz w:val="19"/>
               </w:rPr>
-              <w:t>6 % du montant</w:t>
+              <w:t>Variable par pays/operateur (ex. 6 % sortant)</w:t>
             </w:r>
           </w:p>
         </w:tc>
@@ -649,7 +713,7 @@
                 <w:color w:val="333333"/>
                 <w:sz w:val="19"/>
               </w:rPr>
-              <w:t>6 % du montant</w:t>
+              <w:t>Variable selon configuration</w:t>
             </w:r>
           </w:p>
         </w:tc>
@@ -714,7 +778,7 @@
                 <w:color w:val="333333"/>
                 <w:sz w:val="19"/>
               </w:rPr>
-              <w:t>10 % + frais reseau</w:t>
+              <w:t>Frais specifiques crypto + reseau</w:t>
             </w:r>
           </w:p>
         </w:tc>
@@ -748,7 +812,7 @@
           <w:color w:val="333333"/>
           <w:sz w:val="21"/>
         </w:rPr>
-        <w:t>Objectif immediat (dans les 30 prochains jours) : depasser 50 000 000 FCFA de commissions de frais de service sur le mois. A 6 % de commission, cela correspond a un volume mensuel de transactions traite d'environ 833 000 000 FCFA. Cet objectif constitue le premier palier de rentabilite visible et reproductible sur l'ensemble des 17 pays couverts.</w:t>
+        <w:t>Objectif immediat (dans les 30 prochains jours) : depasser 50 000 000 FCFA de commissions de frais de service sur le mois. En prenant les frais indicatifs moyens appliques sur la plateforme, cela correspond a un volume mensuel de transactions traite d'environ 833 000 000 FCFA. Cet objectif constitue le premier palier de rentabilite visible et reproductible sur l'ensemble des 17 pays couverts.</w:t>
       </w:r>
     </w:p>
     <w:p>
@@ -761,7 +825,7 @@
           <w:color w:val="333333"/>
           <w:sz w:val="21"/>
         </w:rPr>
-        <w:t>Objectif a moyen terme : faire croitre ce chiffre de maniere significative en augmentant le volume par pays grace a l'alimentation des wallets operateurs, aux campagnes marketing ciblees et a l'acquisition de nouveaux marchands et integrateurs API.</w:t>
+        <w:t>Objectif a moyen terme : faire croitre ces commissions de maniere significative en augmentant le volume par pays grace a l'alimentation des wallets operateurs, aux campagnes marketing ciblees et a l'acquisition de nouveaux marchands et integrateurs API.</w:t>
       </w:r>
     </w:p>
     <w:p>
@@ -834,7 +898,20 @@
           <w:color w:val="333333"/>
           <w:sz w:val="21"/>
         </w:rPr>
-        <w:t>~20 millions XOF de volume de transactions traite depuis le lancement</w:t>
+        <w:t>~20 millions XOF de volume total de transactions traite depuis le lancement</w:t>
+      </w:r>
+    </w:p>
+    <w:p>
+      <w:pPr>
+        <w:pStyle w:val="ListBullet"/>
+        <w:spacing w:after="40"/>
+      </w:pPr>
+      <w:r>
+        <w:rPr>
+          <w:color w:val="333333"/>
+          <w:sz w:val="21"/>
+        </w:rPr>
+        <w:t>~1,2 million XOF de commissions de frais de service encaissees depuis le lancement</w:t>
       </w:r>
     </w:p>
     <w:p>
@@ -900,19 +977,6 @@
           <w:sz w:val="21"/>
         </w:rPr>
         <w:t>Dashboard admin complet : KYC, suspension, diffusion, historique detaille</w:t>
-      </w:r>
-    </w:p>
-    <w:p>
-      <w:pPr>
-        <w:pStyle w:val="ListBullet"/>
-        <w:spacing w:after="40"/>
-      </w:pPr>
-      <w:r>
-        <w:rPr>
-          <w:color w:val="333333"/>
-          <w:sz w:val="21"/>
-        </w:rPr>
-        <w:t>Systeme de webhooks et callbacks temps reel pour integrations tierces</w:t>
       </w:r>
     </w:p>
     <w:p>
@@ -1290,14 +1354,14 @@
           <w:color w:val="145AA8"/>
           <w:sz w:val="21"/>
         </w:rPr>
-        <w:t xml:space="preserve">  Frais transparents a taux fixe — </w:t>
+        <w:t xml:space="preserve">  Frais adaptes au marche local — </w:t>
       </w:r>
       <w:r>
         <w:rPr>
           <w:color w:val="333333"/>
           <w:sz w:val="21"/>
         </w:rPr>
-        <w:t>6 % uniformes, sans frais caches, sans structure tarifaire complexe. Confiance et adoption facilitees.</w:t>
+        <w:t>Les frais de service sont configures par pays et par operateur, permettant d'optimiser la competitivite sur chaque territoire tout en preservant la rentabilite de la plateforme.</w:t>
       </w:r>
     </w:p>
     <w:p>

</xml_diff>

<commit_message>
Update document title to reflect final corrected version
Modify the title of the BKApay presentation document in the agent assets metadata.

Replit-Commit-Author: Agent
Replit-Commit-Session-Id: a0afa139-8dbe-4692-b45b-1084131419e4
Replit-Commit-Checkpoint-Type: full_checkpoint
Replit-Commit-Event-Id: 8a76129e-3611-4267-99fa-2611cea8417c
Replit-Commit-Screenshot-Url: https://storage.googleapis.com/screenshot-production-us-central1/029ad065-2bca-47a2-a9a6-24e27e1841cc/a0afa139-8dbe-4692-b45b-1084131419e4/Y3zrjeS
Replit-Helium-Checkpoint-Created: true
</commit_message>
<xml_diff>
--- a/BKApay_Dossier_Presentation.docx
+++ b/BKApay_Dossier_Presentation.docx
@@ -99,15 +99,14 @@
         <w:tblLook w:firstColumn="1" w:firstRow="1" w:lastColumn="0" w:lastRow="0" w:noHBand="0" w:noVBand="1" w:val="04A0"/>
       </w:tblPr>
       <w:tblGrid>
-        <w:gridCol w:w="2351"/>
-        <w:gridCol w:w="2351"/>
-        <w:gridCol w:w="2351"/>
-        <w:gridCol w:w="2351"/>
+        <w:gridCol w:w="3135"/>
+        <w:gridCol w:w="3135"/>
+        <w:gridCol w:w="3135"/>
       </w:tblGrid>
       <w:tr>
         <w:tc>
           <w:tcPr>
-            <w:tcW w:type="dxa" w:w="2351"/>
+            <w:tcW w:type="dxa" w:w="3135"/>
             <w:shd w:val="clear" w:color="auto" w:fill="0A295E"/>
             <w:tcBorders>
               <w:top w:val="nil"/>
@@ -124,7 +123,7 @@
               <w:rPr>
                 <w:b/>
                 <w:color w:val="FFFFFF"/>
-                <w:sz w:val="18"/>
+                <w:sz w:val="19"/>
               </w:rPr>
               <w:t>Utilisateurs inscrits</w:t>
             </w:r>
@@ -132,7 +131,7 @@
         </w:tc>
         <w:tc>
           <w:tcPr>
-            <w:tcW w:type="dxa" w:w="2351"/>
+            <w:tcW w:type="dxa" w:w="3135"/>
             <w:shd w:val="clear" w:color="auto" w:fill="0A295E"/>
             <w:tcBorders>
               <w:top w:val="nil"/>
@@ -149,7 +148,7 @@
               <w:rPr>
                 <w:b/>
                 <w:color w:val="FFFFFF"/>
-                <w:sz w:val="18"/>
+                <w:sz w:val="19"/>
               </w:rPr>
               <w:t>KYC verifies</w:t>
             </w:r>
@@ -157,7 +156,7 @@
         </w:tc>
         <w:tc>
           <w:tcPr>
-            <w:tcW w:type="dxa" w:w="2351"/>
+            <w:tcW w:type="dxa" w:w="3135"/>
             <w:shd w:val="clear" w:color="auto" w:fill="0A295E"/>
             <w:tcBorders>
               <w:top w:val="nil"/>
@@ -174,34 +173,9 @@
               <w:rPr>
                 <w:b/>
                 <w:color w:val="FFFFFF"/>
-                <w:sz w:val="18"/>
+                <w:sz w:val="19"/>
               </w:rPr>
               <w:t>Volume traite (total cumule)</w:t>
-            </w:r>
-          </w:p>
-        </w:tc>
-        <w:tc>
-          <w:tcPr>
-            <w:tcW w:type="dxa" w:w="2351"/>
-            <w:shd w:val="clear" w:color="auto" w:fill="0A295E"/>
-            <w:tcBorders>
-              <w:top w:val="nil"/>
-              <w:left w:val="nil"/>
-              <w:bottom w:val="nil"/>
-              <w:right w:val="nil"/>
-            </w:tcBorders>
-          </w:tcPr>
-          <w:p>
-            <w:pPr>
-              <w:jc w:val="center"/>
-            </w:pPr>
-            <w:r>
-              <w:rPr>
-                <w:b/>
-                <w:color w:val="FFFFFF"/>
-                <w:sz w:val="18"/>
-              </w:rPr>
-              <w:t>Commissions encaissees (cumulees)</w:t>
             </w:r>
           </w:p>
         </w:tc>
@@ -209,7 +183,7 @@
       <w:tr>
         <w:tc>
           <w:tcPr>
-            <w:tcW w:type="dxa" w:w="2351"/>
+            <w:tcW w:type="dxa" w:w="3135"/>
             <w:shd w:val="clear" w:color="auto" w:fill="E8F0FA"/>
             <w:tcBorders>
               <w:top w:val="nil"/>
@@ -226,7 +200,7 @@
               <w:rPr>
                 <w:b/>
                 <w:color w:val="0A295E"/>
-                <w:sz w:val="20"/>
+                <w:sz w:val="21"/>
               </w:rPr>
               <w:t>~600 utilisateurs</w:t>
             </w:r>
@@ -234,7 +208,7 @@
         </w:tc>
         <w:tc>
           <w:tcPr>
-            <w:tcW w:type="dxa" w:w="2351"/>
+            <w:tcW w:type="dxa" w:w="3135"/>
             <w:shd w:val="clear" w:color="auto" w:fill="E8F0FA"/>
             <w:tcBorders>
               <w:top w:val="nil"/>
@@ -251,7 +225,7 @@
               <w:rPr>
                 <w:b/>
                 <w:color w:val="0A295E"/>
-                <w:sz w:val="20"/>
+                <w:sz w:val="21"/>
               </w:rPr>
               <w:t>~60 verifies</w:t>
             </w:r>
@@ -259,7 +233,7 @@
         </w:tc>
         <w:tc>
           <w:tcPr>
-            <w:tcW w:type="dxa" w:w="2351"/>
+            <w:tcW w:type="dxa" w:w="3135"/>
             <w:shd w:val="clear" w:color="auto" w:fill="E8F0FA"/>
             <w:tcBorders>
               <w:top w:val="nil"/>
@@ -276,34 +250,9 @@
               <w:rPr>
                 <w:b/>
                 <w:color w:val="0A295E"/>
-                <w:sz w:val="20"/>
+                <w:sz w:val="21"/>
               </w:rPr>
               <w:t>~20 000 000 XOF</w:t>
-            </w:r>
-          </w:p>
-        </w:tc>
-        <w:tc>
-          <w:tcPr>
-            <w:tcW w:type="dxa" w:w="2351"/>
-            <w:shd w:val="clear" w:color="auto" w:fill="E8F0FA"/>
-            <w:tcBorders>
-              <w:top w:val="nil"/>
-              <w:left w:val="nil"/>
-              <w:bottom w:val="nil"/>
-              <w:right w:val="nil"/>
-            </w:tcBorders>
-          </w:tcPr>
-          <w:p>
-            <w:pPr>
-              <w:jc w:val="center"/>
-            </w:pPr>
-            <w:r>
-              <w:rPr>
-                <w:b/>
-                <w:color w:val="0A295E"/>
-                <w:sz w:val="20"/>
-              </w:rPr>
-              <w:t>~1 200 000 XOF</w:t>
             </w:r>
           </w:p>
         </w:tc>
@@ -324,7 +273,7 @@
           <w:color w:val="555555"/>
           <w:sz w:val="18"/>
         </w:rPr>
-        <w:t>Note : le volume traite represente le montant total des transactions passees par la plateforme depuis son lancement. Les commissions encaissees correspondent aux frais de service preleves sur ce volume.</w:t>
+        <w:t>Note : le volume traite represente le montant total des transactions passees par la plateforme depuis son lancement. Ce chiffre est distinct des commissions encaissees par BKApay, qui correspondent aux frais de service preleves sur chaque operation.</w:t>
       </w:r>
     </w:p>
     <w:p>
@@ -431,7 +380,7 @@
           <w:color w:val="333333"/>
           <w:sz w:val="21"/>
         </w:rPr>
-        <w:t>BKApay genere ses revenus via des frais de service appliques a chaque transaction. Ces frais varient selon le pays et l'operateur afin de s'adapter aux conditions locales et aux structures tarifaires des providers de paiement. A titre indicatif, les frais s'elevent typiquement a 6 % pour les paiements entrants et 6 % pour les paiements sortants, mais peuvent etre ajustes par l'administrateur selon les marches.</w:t>
+        <w:t>BKApay genere ses revenus via des frais de service appliques a chaque transaction. Ces frais varient selon le pays et l'operateur afin de s'adapter aux conditions locales. A titre d'exemple, les frais peuvent s'elever a 6 % sur les paiements entrants (depots) et 6 % sur les paiements sortants (retraits), soit 12 % preleves au total sur un cycle complet depot-retrait. Cette double facturation sur chaque sens du flux constitue le moteur principal de generation de revenus de la plateforme.</w:t>
       </w:r>
     </w:p>
     <w:tbl>
@@ -518,7 +467,7 @@
                 <w:color w:val="FFFFFF"/>
                 <w:sz w:val="19"/>
               </w:rPr>
-              <w:t>Frais indicatifs</w:t>
+              <w:t>Frais (exemple indicatif)</w:t>
             </w:r>
           </w:p>
         </w:tc>
@@ -583,7 +532,7 @@
                 <w:color w:val="333333"/>
                 <w:sz w:val="19"/>
               </w:rPr>
-              <w:t>Variable par pays/operateur (ex. 6 % entrant)</w:t>
+              <w:t>6 % sur le montant entrant</w:t>
             </w:r>
           </w:p>
         </w:tc>
@@ -648,7 +597,7 @@
                 <w:color w:val="333333"/>
                 <w:sz w:val="19"/>
               </w:rPr>
-              <w:t>Variable par pays/operateur (ex. 6 % sortant)</w:t>
+              <w:t>6 % sur le montant sortant</w:t>
             </w:r>
           </w:p>
         </w:tc>
@@ -671,7 +620,7 @@
                 <w:color w:val="333333"/>
                 <w:sz w:val="19"/>
               </w:rPr>
-              <w:t>Transferts internes</w:t>
+              <w:t>Cycle complet depot + retrait</w:t>
             </w:r>
           </w:p>
         </w:tc>
@@ -692,7 +641,7 @@
                 <w:color w:val="333333"/>
                 <w:sz w:val="19"/>
               </w:rPr>
-              <w:t>Personne vers Personne / Business</w:t>
+              <w:t>Flux entrant puis sortant</w:t>
             </w:r>
           </w:p>
         </w:tc>
@@ -713,7 +662,7 @@
                 <w:color w:val="333333"/>
                 <w:sz w:val="19"/>
               </w:rPr>
-              <w:t>Variable selon configuration</w:t>
+              <w:t>Jusqu'a 12 % au total preleves</w:t>
             </w:r>
           </w:p>
         </w:tc>
@@ -791,6 +740,19 @@
     </w:p>
     <w:p>
       <w:pPr>
+        <w:spacing w:after="120"/>
+      </w:pPr>
+      <w:r>
+        <w:rPr>
+          <w:i/>
+          <w:color w:val="555555"/>
+          <w:sz w:val="18"/>
+        </w:rPr>
+        <w:t>Note : les taux ci-dessus sont donnes a titre d'exemple. Les frais reels sont configures par l'administrateur selon le pays, l'operateur et le type d'operation.</w:t>
+      </w:r>
+    </w:p>
+    <w:p>
+      <w:pPr>
         <w:spacing w:before="120" w:after="80"/>
       </w:pPr>
       <w:r>
@@ -812,7 +774,7 @@
           <w:color w:val="333333"/>
           <w:sz w:val="21"/>
         </w:rPr>
-        <w:t>Objectif immediat (dans les 30 prochains jours) : depasser 50 000 000 FCFA de commissions de frais de service sur le mois. En prenant les frais indicatifs moyens appliques sur la plateforme, cela correspond a un volume mensuel de transactions traite d'environ 833 000 000 FCFA. Cet objectif constitue le premier palier de rentabilite visible et reproductible sur l'ensemble des 17 pays couverts.</w:t>
+        <w:t>Objectif immediat (dans les 30 prochains jours) : depasser 50 000 000 FCFA de commissions de frais de service sur le mois. Avec des frais moyens appliques sur les flux entrants et sortants, cet objectif est atteignable a partir d'un volume mensuel de transactions bien en deca des capacites techniques de la plateforme. Il constitue le premier palier de rentabilite visible et reproductible sur l'ensemble des 17 pays couverts.</w:t>
       </w:r>
     </w:p>
     <w:p>
@@ -911,7 +873,7 @@
           <w:color w:val="333333"/>
           <w:sz w:val="21"/>
         </w:rPr>
-        <w:t>~1,2 million XOF de commissions de frais de service encaissees depuis le lancement</w:t>
+        <w:t>Frais de service preleves sur chaque flux entrant et sortant, genererrant des commissions reelles</w:t>
       </w:r>
     </w:p>
     <w:p>
@@ -1374,6 +1336,26 @@
           <w:color w:val="145AA8"/>
           <w:sz w:val="21"/>
         </w:rPr>
+        <w:t xml:space="preserve">  Double prelevement sur le cycle complet — </w:t>
+      </w:r>
+      <w:r>
+        <w:rPr>
+          <w:color w:val="333333"/>
+          <w:sz w:val="21"/>
+        </w:rPr>
+        <w:t>Les frais sont appliques a l'entree et a la sortie des fonds, ce qui maximise le revenu par utilisateur actif sans alourdir la perception tarifaire sur une seule operation.</w:t>
+      </w:r>
+    </w:p>
+    <w:p>
+      <w:pPr>
+        <w:spacing w:after="60"/>
+      </w:pPr>
+      <w:r>
+        <w:rPr>
+          <w:b/>
+          <w:color w:val="145AA8"/>
+          <w:sz w:val="21"/>
+        </w:rPr>
         <w:t xml:space="preserve">  API Provider-agnostique — </w:t>
       </w:r>
       <w:r>
@@ -1402,26 +1384,6 @@
           <w:sz w:val="21"/>
         </w:rPr>
         <w:t>Un assistant conversationnel permet aux utilisateurs de realiser des transactions en langage naturel, reduisant la friction et elargissant l'audience.</w:t>
-      </w:r>
-    </w:p>
-    <w:p>
-      <w:pPr>
-        <w:spacing w:after="60"/>
-      </w:pPr>
-      <w:r>
-        <w:rPr>
-          <w:b/>
-          <w:color w:val="145AA8"/>
-          <w:sz w:val="21"/>
-        </w:rPr>
-        <w:t xml:space="preserve">  Modele double (B2C + B2B) — </w:t>
-      </w:r>
-      <w:r>
-        <w:rPr>
-          <w:color w:val="333333"/>
-          <w:sz w:val="21"/>
-        </w:rPr>
-        <w:t>Particuliers via liens de paiement, entreprises via API. Deux moteurs de volume sur la meme infrastructure.</w:t>
       </w:r>
     </w:p>
     <w:p>

</xml_diff>

<commit_message>
Update document to include contact and signature information
Update .agents/agent_assets_metadata.toml and BKApay_Dossier_Presentation.docx to reflect the addition of contact details and signature fields.

Replit-Commit-Author: Agent
Replit-Commit-Session-Id: a0afa139-8dbe-4692-b45b-1084131419e4
Replit-Commit-Checkpoint-Type: full_checkpoint
Replit-Commit-Event-Id: 868fd465-693d-432f-9018-416e50b8e167
Replit-Commit-Screenshot-Url: https://storage.googleapis.com/screenshot-production-us-central1/029ad065-2bca-47a2-a9a6-24e27e1841cc/a0afa139-8dbe-4692-b45b-1084131419e4/Y3zrjeS
Replit-Helium-Checkpoint-Created: true
</commit_message>
<xml_diff>
--- a/BKApay_Dossier_Presentation.docx
+++ b/BKApay_Dossier_Presentation.docx
@@ -774,7 +774,7 @@
           <w:color w:val="333333"/>
           <w:sz w:val="21"/>
         </w:rPr>
-        <w:t>Objectif immediat (dans les 30 prochains jours) : depasser 50 000 000 FCFA de commissions de frais de service sur le mois. Avec des frais moyens appliques sur les flux entrants et sortants, cet objectif est atteignable a partir d'un volume mensuel de transactions bien en deca des capacites techniques de la plateforme. Il constitue le premier palier de rentabilite visible et reproductible sur l'ensemble des 17 pays couverts.</w:t>
+        <w:t>Objectif immediat (dans les 30 prochains jours) : depasser 50 000 000 FCFA de commissions de frais de service sur le mois. Avec des frais appliques sur les flux entrants et sortants, cet objectif est atteignable a partir d'un volume mensuel de transactions bien en deca des capacites techniques de la plateforme. Il constitue le premier palier de rentabilite visible et reproductible sur l'ensemble des 17 pays couverts.</w:t>
       </w:r>
     </w:p>
     <w:p>
@@ -873,7 +873,7 @@
           <w:color w:val="333333"/>
           <w:sz w:val="21"/>
         </w:rPr>
-        <w:t>Frais de service preleves sur chaque flux entrant et sortant, genererrant des commissions reelles</w:t>
+        <w:t>Frais de service preleves sur chaque flux entrant et sortant, generant des commissions reelles</w:t>
       </w:r>
     </w:p>
     <w:p>
@@ -1534,7 +1534,7 @@
     </w:p>
     <w:p>
       <w:pPr>
-        <w:spacing w:after="80"/>
+        <w:spacing w:after="120"/>
       </w:pPr>
     </w:p>
     <w:p>
@@ -1547,16 +1547,262 @@
     </w:p>
     <w:p>
       <w:pPr>
-        <w:spacing w:before="120"/>
+        <w:spacing w:after="40"/>
+      </w:pPr>
+    </w:p>
+    <w:p>
+      <w:pPr>
+        <w:spacing w:after="40"/>
+      </w:pPr>
+      <w:r>
+        <w:rPr>
+          <w:color w:val="555555"/>
+          <w:sz w:val="20"/>
+        </w:rPr>
+        <w:t>Fait a _________________________, le _________________________</w:t>
+      </w:r>
+    </w:p>
+    <w:p>
+      <w:pPr>
+        <w:spacing w:after="160"/>
+      </w:pPr>
+    </w:p>
+    <w:p>
+      <w:pPr>
+        <w:spacing w:after="40"/>
         <w:jc w:val="center"/>
       </w:pPr>
       <w:r>
         <w:rPr>
-          <w:color w:val="555555"/>
-          <w:sz w:val="18"/>
+          <w:b/>
+          <w:color w:val="0A295E"/>
+          <w:sz w:val="26"/>
         </w:rPr>
-        <w:t>Kpetekousso Emali Juste  |  Fondateur &amp; CEO, BKApay  |  bkapay.com</w:t>
+        <w:t>Kpetekousso Emali Juste</w:t>
       </w:r>
+    </w:p>
+    <w:p>
+      <w:pPr>
+        <w:spacing w:after="200"/>
+        <w:jc w:val="center"/>
+      </w:pPr>
+      <w:r>
+        <w:rPr>
+          <w:color w:val="145AA8"/>
+          <w:sz w:val="21"/>
+        </w:rPr>
+        <w:t>Fondateur &amp; CEO — BKApay</w:t>
+      </w:r>
+    </w:p>
+    <w:p>
+      <w:pPr>
+        <w:spacing w:before="40" w:after="40"/>
+        <w:pBdr>
+          <w:bottom w:val="single" w:sz="6" w:space="1" w:color="CCCCCC"/>
+        </w:pBdr>
+      </w:pPr>
+    </w:p>
+    <w:p>
+      <w:pPr>
+        <w:spacing w:after="40"/>
+      </w:pPr>
+    </w:p>
+    <w:tbl>
+      <w:tblPr>
+        <w:tblStyle w:val="TableGrid"/>
+        <w:tblW w:type="auto" w:w="0"/>
+        <w:jc w:val="center"/>
+        <w:tblLook w:firstColumn="1" w:firstRow="1" w:lastColumn="0" w:lastRow="0" w:noHBand="0" w:noVBand="1" w:val="04A0"/>
+      </w:tblPr>
+      <w:tblGrid>
+        <w:gridCol w:w="4703"/>
+        <w:gridCol w:w="4703"/>
+      </w:tblGrid>
+      <w:tr>
+        <w:tc>
+          <w:tcPr>
+            <w:tcW w:type="dxa" w:w="4703"/>
+            <w:shd w:val="clear" w:color="auto" w:fill="F5F8FF"/>
+            <w:tcBorders>
+              <w:top w:val="nil"/>
+              <w:left w:val="nil"/>
+              <w:bottom w:val="nil"/>
+              <w:right w:val="nil"/>
+            </w:tcBorders>
+          </w:tcPr>
+          <w:p>
+            <w:r>
+              <w:rPr>
+                <w:b/>
+                <w:color w:val="555555"/>
+                <w:sz w:val="19"/>
+              </w:rPr>
+              <w:t>Site web</w:t>
+            </w:r>
+          </w:p>
+        </w:tc>
+        <w:tc>
+          <w:tcPr>
+            <w:tcW w:type="dxa" w:w="4703"/>
+            <w:shd w:val="clear" w:color="auto" w:fill="F5F8FF"/>
+            <w:tcBorders>
+              <w:top w:val="nil"/>
+              <w:left w:val="nil"/>
+              <w:bottom w:val="nil"/>
+              <w:right w:val="nil"/>
+            </w:tcBorders>
+          </w:tcPr>
+          <w:p>
+            <w:r>
+              <w:rPr>
+                <w:color w:val="333333"/>
+                <w:sz w:val="19"/>
+              </w:rPr>
+              <w:t>bkapay.com</w:t>
+            </w:r>
+          </w:p>
+        </w:tc>
+      </w:tr>
+      <w:tr>
+        <w:tc>
+          <w:tcPr>
+            <w:tcW w:type="dxa" w:w="4703"/>
+            <w:shd w:val="clear" w:color="auto" w:fill="FFFFFF"/>
+            <w:tcBorders>
+              <w:top w:val="nil"/>
+              <w:left w:val="nil"/>
+              <w:bottom w:val="nil"/>
+              <w:right w:val="nil"/>
+            </w:tcBorders>
+          </w:tcPr>
+          <w:p>
+            <w:r>
+              <w:rPr>
+                <w:b/>
+                <w:color w:val="555555"/>
+                <w:sz w:val="19"/>
+              </w:rPr>
+              <w:t>Email professionnel</w:t>
+            </w:r>
+          </w:p>
+        </w:tc>
+        <w:tc>
+          <w:tcPr>
+            <w:tcW w:type="dxa" w:w="4703"/>
+            <w:shd w:val="clear" w:color="auto" w:fill="FFFFFF"/>
+            <w:tcBorders>
+              <w:top w:val="nil"/>
+              <w:left w:val="nil"/>
+              <w:bottom w:val="nil"/>
+              <w:right w:val="nil"/>
+            </w:tcBorders>
+          </w:tcPr>
+          <w:p>
+            <w:r>
+              <w:rPr>
+                <w:color w:val="333333"/>
+                <w:sz w:val="19"/>
+              </w:rPr>
+              <w:t>support@bkapay.com</w:t>
+            </w:r>
+          </w:p>
+        </w:tc>
+      </w:tr>
+      <w:tr>
+        <w:tc>
+          <w:tcPr>
+            <w:tcW w:type="dxa" w:w="4703"/>
+            <w:shd w:val="clear" w:color="auto" w:fill="F5F8FF"/>
+            <w:tcBorders>
+              <w:top w:val="nil"/>
+              <w:left w:val="nil"/>
+              <w:bottom w:val="nil"/>
+              <w:right w:val="nil"/>
+            </w:tcBorders>
+          </w:tcPr>
+          <w:p>
+            <w:r>
+              <w:rPr>
+                <w:b/>
+                <w:color w:val="555555"/>
+                <w:sz w:val="19"/>
+              </w:rPr>
+              <w:t>Email personnel</w:t>
+            </w:r>
+          </w:p>
+        </w:tc>
+        <w:tc>
+          <w:tcPr>
+            <w:tcW w:type="dxa" w:w="4703"/>
+            <w:shd w:val="clear" w:color="auto" w:fill="F5F8FF"/>
+            <w:tcBorders>
+              <w:top w:val="nil"/>
+              <w:left w:val="nil"/>
+              <w:bottom w:val="nil"/>
+              <w:right w:val="nil"/>
+            </w:tcBorders>
+          </w:tcPr>
+          <w:p>
+            <w:r>
+              <w:rPr>
+                <w:color w:val="333333"/>
+                <w:sz w:val="19"/>
+              </w:rPr>
+              <w:t>kpetekoussojuste11@gmail.com</w:t>
+            </w:r>
+          </w:p>
+        </w:tc>
+      </w:tr>
+      <w:tr>
+        <w:tc>
+          <w:tcPr>
+            <w:tcW w:type="dxa" w:w="4703"/>
+            <w:shd w:val="clear" w:color="auto" w:fill="FFFFFF"/>
+            <w:tcBorders>
+              <w:top w:val="nil"/>
+              <w:left w:val="nil"/>
+              <w:bottom w:val="nil"/>
+              <w:right w:val="nil"/>
+            </w:tcBorders>
+          </w:tcPr>
+          <w:p>
+            <w:r>
+              <w:rPr>
+                <w:b/>
+                <w:color w:val="555555"/>
+                <w:sz w:val="19"/>
+              </w:rPr>
+              <w:t>Telephone / WhatsApp</w:t>
+            </w:r>
+          </w:p>
+        </w:tc>
+        <w:tc>
+          <w:tcPr>
+            <w:tcW w:type="dxa" w:w="4703"/>
+            <w:shd w:val="clear" w:color="auto" w:fill="FFFFFF"/>
+            <w:tcBorders>
+              <w:top w:val="nil"/>
+              <w:left w:val="nil"/>
+              <w:bottom w:val="nil"/>
+              <w:right w:val="nil"/>
+            </w:tcBorders>
+          </w:tcPr>
+          <w:p>
+            <w:r>
+              <w:rPr>
+                <w:color w:val="333333"/>
+                <w:sz w:val="19"/>
+              </w:rPr>
+              <w:t>+229 01 46 44 73 19</w:t>
+            </w:r>
+          </w:p>
+        </w:tc>
+      </w:tr>
+    </w:tbl>
+    <w:p>
+      <w:pPr>
+        <w:spacing w:after="120"/>
+      </w:pPr>
     </w:p>
     <w:sectPr>
       <w:pgSz w:w="12240" w:h="15840"/>

</xml_diff>

<commit_message>
Update document presentation details
Update the title of the BKApay presentation document.

Replit-Commit-Author: Agent
Replit-Commit-Session-Id: a0afa139-8dbe-4692-b45b-1084131419e4
Replit-Commit-Checkpoint-Type: full_checkpoint
Replit-Commit-Event-Id: bd992f3c-7c7b-4645-bd6f-51d8002f1603
Replit-Commit-Screenshot-Url: https://storage.googleapis.com/screenshot-production-us-central1/029ad065-2bca-47a2-a9a6-24e27e1841cc/a0afa139-8dbe-4692-b45b-1084131419e4/Y3zrjeS
Replit-Helium-Checkpoint-Created: true
</commit_message>
<xml_diff>
--- a/BKApay_Dossier_Presentation.docx
+++ b/BKApay_Dossier_Presentation.docx
@@ -45,7 +45,7 @@
     </w:p>
     <w:p>
       <w:pPr>
-        <w:spacing w:after="200"/>
+        <w:spacing w:after="40"/>
         <w:jc w:val="center"/>
       </w:pPr>
       <w:r>
@@ -55,6 +55,19 @@
           <w:sz w:val="22"/>
         </w:rPr>
         <w:t>Kpetekousso Emali Juste  —  Fondateur &amp; CEO</w:t>
+      </w:r>
+    </w:p>
+    <w:p>
+      <w:pPr>
+        <w:spacing w:after="200"/>
+        <w:jc w:val="center"/>
+      </w:pPr>
+      <w:r>
+        <w:rPr>
+          <w:color w:val="555555"/>
+          <w:sz w:val="19"/>
+        </w:rPr>
+        <w:t>En production depuis novembre 2025  |  17 pays operationnels  |  Mai 2026</w:t>
       </w:r>
     </w:p>
     <w:p>
@@ -88,7 +101,7 @@
           <w:color w:val="333333"/>
           <w:sz w:val="21"/>
         </w:rPr>
-        <w:t>BKApay est une infrastructure de paiement mobile money operationnelle dans 17 pays africains, permettant a des particuliers, entreprises et developpeurs d'envoyer, recevoir et gerer des fonds via les reseaux telephoniques locaux (Orange Money, MTN MoMo, Wave, etc.). La plateforme est live, genere des commissions reelles et croit activement sur ses marches cles.</w:t>
+        <w:t>BKApay est une infrastructure de paiement mobile money lancee en production en novembre 2025, operationnelle dans 17 pays africains six mois apres son lancement, sans interruption de service et sans anomalie technique majeure. La plateforme permet a des particuliers, des entreprises et des developpeurs d'envoyer, recevoir et gerer des fonds via les reseaux telephoniques locaux (Orange Money, MTN MoMo, Wave, Moov, Airtel, etc.). Elle genere des commissions reelles et croit activement sur ses marches cles.</w:t>
       </w:r>
     </w:p>
     <w:tbl>
@@ -99,14 +112,15 @@
         <w:tblLook w:firstColumn="1" w:firstRow="1" w:lastColumn="0" w:lastRow="0" w:noHBand="0" w:noVBand="1" w:val="04A0"/>
       </w:tblPr>
       <w:tblGrid>
-        <w:gridCol w:w="3135"/>
-        <w:gridCol w:w="3135"/>
-        <w:gridCol w:w="3135"/>
+        <w:gridCol w:w="2351"/>
+        <w:gridCol w:w="2351"/>
+        <w:gridCol w:w="2351"/>
+        <w:gridCol w:w="2351"/>
       </w:tblGrid>
       <w:tr>
         <w:tc>
           <w:tcPr>
-            <w:tcW w:type="dxa" w:w="3135"/>
+            <w:tcW w:type="dxa" w:w="2351"/>
             <w:shd w:val="clear" w:color="auto" w:fill="0A295E"/>
             <w:tcBorders>
               <w:top w:val="nil"/>
@@ -123,15 +137,15 @@
               <w:rPr>
                 <w:b/>
                 <w:color w:val="FFFFFF"/>
-                <w:sz w:val="19"/>
+                <w:sz w:val="18"/>
               </w:rPr>
-              <w:t>Utilisateurs inscrits</w:t>
+              <w:t>Lancement</w:t>
             </w:r>
           </w:p>
         </w:tc>
         <w:tc>
           <w:tcPr>
-            <w:tcW w:type="dxa" w:w="3135"/>
+            <w:tcW w:type="dxa" w:w="2351"/>
             <w:shd w:val="clear" w:color="auto" w:fill="0A295E"/>
             <w:tcBorders>
               <w:top w:val="nil"/>
@@ -148,15 +162,15 @@
               <w:rPr>
                 <w:b/>
                 <w:color w:val="FFFFFF"/>
-                <w:sz w:val="19"/>
+                <w:sz w:val="18"/>
               </w:rPr>
-              <w:t>KYC verifies</w:t>
+              <w:t>Utilisateurs inscrits</w:t>
             </w:r>
           </w:p>
         </w:tc>
         <w:tc>
           <w:tcPr>
-            <w:tcW w:type="dxa" w:w="3135"/>
+            <w:tcW w:type="dxa" w:w="2351"/>
             <w:shd w:val="clear" w:color="auto" w:fill="0A295E"/>
             <w:tcBorders>
               <w:top w:val="nil"/>
@@ -173,9 +187,34 @@
               <w:rPr>
                 <w:b/>
                 <w:color w:val="FFFFFF"/>
-                <w:sz w:val="19"/>
+                <w:sz w:val="18"/>
               </w:rPr>
-              <w:t>Volume traite (total cumule)</w:t>
+              <w:t>KYC verifies</w:t>
+            </w:r>
+          </w:p>
+        </w:tc>
+        <w:tc>
+          <w:tcPr>
+            <w:tcW w:type="dxa" w:w="2351"/>
+            <w:shd w:val="clear" w:color="auto" w:fill="0A295E"/>
+            <w:tcBorders>
+              <w:top w:val="nil"/>
+              <w:left w:val="nil"/>
+              <w:bottom w:val="nil"/>
+              <w:right w:val="nil"/>
+            </w:tcBorders>
+          </w:tcPr>
+          <w:p>
+            <w:pPr>
+              <w:jc w:val="center"/>
+            </w:pPr>
+            <w:r>
+              <w:rPr>
+                <w:b/>
+                <w:color w:val="FFFFFF"/>
+                <w:sz w:val="18"/>
+              </w:rPr>
+              <w:t>Volume traite (cumule)</w:t>
             </w:r>
           </w:p>
         </w:tc>
@@ -183,7 +222,7 @@
       <w:tr>
         <w:tc>
           <w:tcPr>
-            <w:tcW w:type="dxa" w:w="3135"/>
+            <w:tcW w:type="dxa" w:w="2351"/>
             <w:shd w:val="clear" w:color="auto" w:fill="E8F0FA"/>
             <w:tcBorders>
               <w:top w:val="nil"/>
@@ -200,15 +239,15 @@
               <w:rPr>
                 <w:b/>
                 <w:color w:val="0A295E"/>
-                <w:sz w:val="21"/>
+                <w:sz w:val="20"/>
               </w:rPr>
-              <w:t>~600 utilisateurs</w:t>
+              <w:t>Novembre 2025</w:t>
             </w:r>
           </w:p>
         </w:tc>
         <w:tc>
           <w:tcPr>
-            <w:tcW w:type="dxa" w:w="3135"/>
+            <w:tcW w:type="dxa" w:w="2351"/>
             <w:shd w:val="clear" w:color="auto" w:fill="E8F0FA"/>
             <w:tcBorders>
               <w:top w:val="nil"/>
@@ -225,15 +264,15 @@
               <w:rPr>
                 <w:b/>
                 <w:color w:val="0A295E"/>
-                <w:sz w:val="21"/>
+                <w:sz w:val="20"/>
               </w:rPr>
-              <w:t>~60 verifies</w:t>
+              <w:t>~600 utilisateurs</w:t>
             </w:r>
           </w:p>
         </w:tc>
         <w:tc>
           <w:tcPr>
-            <w:tcW w:type="dxa" w:w="3135"/>
+            <w:tcW w:type="dxa" w:w="2351"/>
             <w:shd w:val="clear" w:color="auto" w:fill="E8F0FA"/>
             <w:tcBorders>
               <w:top w:val="nil"/>
@@ -250,7 +289,32 @@
               <w:rPr>
                 <w:b/>
                 <w:color w:val="0A295E"/>
-                <w:sz w:val="21"/>
+                <w:sz w:val="20"/>
+              </w:rPr>
+              <w:t>~60 verifies</w:t>
+            </w:r>
+          </w:p>
+        </w:tc>
+        <w:tc>
+          <w:tcPr>
+            <w:tcW w:type="dxa" w:w="2351"/>
+            <w:shd w:val="clear" w:color="auto" w:fill="E8F0FA"/>
+            <w:tcBorders>
+              <w:top w:val="nil"/>
+              <w:left w:val="nil"/>
+              <w:bottom w:val="nil"/>
+              <w:right w:val="nil"/>
+            </w:tcBorders>
+          </w:tcPr>
+          <w:p>
+            <w:pPr>
+              <w:jc w:val="center"/>
+            </w:pPr>
+            <w:r>
+              <w:rPr>
+                <w:b/>
+                <w:color w:val="0A295E"/>
+                <w:sz w:val="20"/>
               </w:rPr>
               <w:t>~20 000 000 XOF</w:t>
             </w:r>
@@ -346,7 +410,7 @@
           <w:color w:val="333333"/>
           <w:sz w:val="21"/>
         </w:rPr>
-        <w:t>BKApay centralise l'acces a tous ces operateurs via une API unique, des liens de paiement sans code, un tableau de bord marchand complet et un assistant IA (EMALI) pour piloter les transactions en langage naturel. Les frais de service sont adaptes par pays et par operateur pour rester competitifs sur chaque marche. Deploiement immediat dans 17 pays.</w:t>
+        <w:t>BKApay centralise l'acces a tous ces operateurs via une API unique, des liens de paiement sans code, un tableau de bord marchand complet et un assistant IA (EMALI) pour piloter les transactions en langage naturel. Les frais de service sont adaptes par pays et par operateur pour rester competitifs sur chaque marche. La plateforme est deploye et fonctionnel dans 17 pays depuis son lancement en novembre 2025, avec une stabilite technique confirmee sur six mois de production reelle.</w:t>
       </w:r>
     </w:p>
     <w:p>
@@ -735,7 +799,7 @@
     </w:tbl>
     <w:p>
       <w:pPr>
-        <w:spacing w:after="80"/>
+        <w:spacing w:after="60"/>
       </w:pPr>
     </w:p>
     <w:p>
@@ -813,15 +877,15 @@
     </w:p>
     <w:p>
       <w:pPr>
-        <w:pStyle w:val="ListBullet"/>
-        <w:spacing w:after="40"/>
+        <w:spacing w:after="60"/>
       </w:pPr>
       <w:r>
         <w:rPr>
+          <w:b w:val="0"/>
           <w:color w:val="333333"/>
           <w:sz w:val="21"/>
         </w:rPr>
-        <w:t>Plateforme live en production (bkapay.com), accessible 24h/24 et 7j/7</w:t>
+        <w:t>Six mois apres son lancement en novembre 2025, BKApay tourne en production sans interruption et sans anomalie technique majeure. L'ensemble des 17 pays est operationnel, les flux entrants et sortants fonctionnent correctement pour chaque operateur integre, et la plateforme a deja traite des transactions reelles avec des utilisateurs actifs.</w:t>
       </w:r>
     </w:p>
     <w:p>
@@ -834,7 +898,33 @@
           <w:color w:val="333333"/>
           <w:sz w:val="21"/>
         </w:rPr>
-        <w:t>17 pays couverts avec plusieurs operateurs par pays (Orange, MTN, Wave, Moov, Airtel...)</w:t>
+        <w:t>Lancement en production : novembre 2025 — 6 mois de fonctionnement continu sans incident majeur</w:t>
+      </w:r>
+    </w:p>
+    <w:p>
+      <w:pPr>
+        <w:pStyle w:val="ListBullet"/>
+        <w:spacing w:after="40"/>
+      </w:pPr>
+      <w:r>
+        <w:rPr>
+          <w:color w:val="333333"/>
+          <w:sz w:val="21"/>
+        </w:rPr>
+        <w:t>17 pays couverts et pleinement operationnels (Orange, MTN, Wave, Moov, Airtel et autres)</w:t>
+      </w:r>
+    </w:p>
+    <w:p>
+      <w:pPr>
+        <w:pStyle w:val="ListBullet"/>
+        <w:spacing w:after="40"/>
+      </w:pPr>
+      <w:r>
+        <w:rPr>
+          <w:color w:val="333333"/>
+          <w:sz w:val="21"/>
+        </w:rPr>
+        <w:t>Plateforme stable, sans erreur critique, disponible 24h/24 et 7j/7 sur bkapay.com</w:t>
       </w:r>
     </w:p>
     <w:p>
@@ -1296,6 +1386,26 @@
           <w:color w:val="145AA8"/>
           <w:sz w:val="21"/>
         </w:rPr>
+        <w:t xml:space="preserve">  Produit live depuis novembre 2025 — </w:t>
+      </w:r>
+      <w:r>
+        <w:rPr>
+          <w:color w:val="333333"/>
+          <w:sz w:val="21"/>
+        </w:rPr>
+        <w:t>Six mois de production reelle sans incident majeur dans 17 pays. Ce n'est pas un prototype ni une demo — c'est une infrastructure qui fonctionne et qui a deja traite des transactions reelles.</w:t>
+      </w:r>
+    </w:p>
+    <w:p>
+      <w:pPr>
+        <w:spacing w:after="60"/>
+      </w:pPr>
+      <w:r>
+        <w:rPr>
+          <w:b/>
+          <w:color w:val="145AA8"/>
+          <w:sz w:val="21"/>
+        </w:rPr>
         <w:t xml:space="preserve">  Multi-pays &amp; multi-operateurs natif — </w:t>
       </w:r>
       <w:r>
@@ -1303,7 +1413,7 @@
           <w:color w:val="333333"/>
           <w:sz w:val="21"/>
         </w:rPr>
-        <w:t>17 pays couverts via une architecture modulaire qui permet d'ajouter un pays en quelques heures.</w:t>
+        <w:t>17 pays couverts et operationnels via une architecture modulaire permettant d'ajouter un nouveau pays rapidement.</w:t>
       </w:r>
     </w:p>
     <w:p>
@@ -1323,7 +1433,7 @@
           <w:color w:val="333333"/>
           <w:sz w:val="21"/>
         </w:rPr>
-        <w:t>Les frais de service sont configures par pays et par operateur, permettant d'optimiser la competitivite sur chaque territoire tout en preservant la rentabilite de la plateforme.</w:t>
+        <w:t>Les frais de service sont configures par pays et par operateur, permettant d'optimiser la competitivite sur chaque territoire.</w:t>
       </w:r>
     </w:p>
     <w:p>
@@ -1343,7 +1453,7 @@
           <w:color w:val="333333"/>
           <w:sz w:val="21"/>
         </w:rPr>
-        <w:t>Les frais sont appliques a l'entree et a la sortie des fonds, ce qui maximise le revenu par utilisateur actif sans alourdir la perception tarifaire sur une seule operation.</w:t>
+        <w:t>Les frais sont appliques a l'entree et a la sortie des fonds, maximisant le revenu par utilisateur actif.</w:t>
       </w:r>
     </w:p>
     <w:p>
@@ -1417,7 +1527,7 @@
           <w:color w:val="333333"/>
           <w:sz w:val="21"/>
         </w:rPr>
-        <w:t>BKApay est un projet a l'idee solide, au produit fonctionnel et a la traction reelle. Ce qui nous manque aujourd'hui n'est pas une preuve de concept — c'est une structuration rigoureuse du narratif investisseur, une modelisation financiere defendable face a des fonds ou des partenaires institutionnels, et un cadrage strategique sur les prochaines etapes de croissance.</w:t>
+        <w:t>BKApay est un projet a l'idee solide, au produit fonctionnel depuis six mois en production et a la traction reelle. Ce qui nous manque aujourd'hui n'est pas une preuve de concept — c'est une structuration rigoureuse du narratif investisseur, une modelisation financiere defendable face a des fonds ou des partenaires institutionnels, et un cadrage strategique sur les prochaines etapes de croissance.</w:t>
       </w:r>
     </w:p>
     <w:p>

</xml_diff>

<commit_message>
Update document title to a simpler version
Remove the date from the document title in the metadata and the document itself.

Replit-Commit-Author: Agent
Replit-Commit-Session-Id: a0afa139-8dbe-4692-b45b-1084131419e4
Replit-Commit-Checkpoint-Type: full_checkpoint
Replit-Commit-Event-Id: 6f719f79-80b7-467d-a2a3-861f89598868
Replit-Commit-Screenshot-Url: https://storage.googleapis.com/screenshot-production-us-central1/029ad065-2bca-47a2-a9a6-24e27e1841cc/a0afa139-8dbe-4692-b45b-1084131419e4/Y3zrjeS
Replit-Helium-Checkpoint-Created: true
</commit_message>
<xml_diff>
--- a/BKApay_Dossier_Presentation.docx
+++ b/BKApay_Dossier_Presentation.docx
@@ -67,7 +67,7 @@
           <w:color w:val="555555"/>
           <w:sz w:val="19"/>
         </w:rPr>
-        <w:t>En production depuis novembre 2025  |  17 pays operationnels  |  Mai 2026</w:t>
+        <w:t>En production depuis novembre 2025  |  17 pays operationnels</w:t>
       </w:r>
     </w:p>
     <w:p>
@@ -410,7 +410,7 @@
           <w:color w:val="333333"/>
           <w:sz w:val="21"/>
         </w:rPr>
-        <w:t>BKApay centralise l'acces a tous ces operateurs via une API unique, des liens de paiement sans code, un tableau de bord marchand complet et un assistant IA (EMALI) pour piloter les transactions en langage naturel. Les frais de service sont adaptes par pays et par operateur pour rester competitifs sur chaque marche. La plateforme est deploye et fonctionnel dans 17 pays depuis son lancement en novembre 2025, avec une stabilite technique confirmee sur six mois de production reelle.</w:t>
+        <w:t>BKApay centralise l'acces a tous ces operateurs via une API unique, des liens de paiement sans code, un tableau de bord marchand complet et un assistant IA (EMALI) pour piloter les transactions en langage naturel. Les frais de service sont adaptes par pays et par operateur pour rester competitifs sur chaque marche. La plateforme est deployee et fonctionnelle dans 17 pays depuis son lancement en novembre 2025, avec une stabilite technique confirmee sur six mois de production reelle.</w:t>
       </w:r>
     </w:p>
     <w:p>

</xml_diff>

<commit_message>
Provide downloadable presentation documents in PDF and Word formats
Update PDF and Word document generation to include automatic opening upon download and fix title spacing.

Replit-Commit-Author: Agent
Replit-Commit-Session-Id: a0afa139-8dbe-4692-b45b-1084131419e4
Replit-Commit-Checkpoint-Type: full_checkpoint
Replit-Commit-Event-Id: 04c6d3fa-0612-40cc-9292-1e72686a4c8f
Replit-Commit-Screenshot-Url: https://storage.googleapis.com/screenshot-production-us-central1/029ad065-2bca-47a2-a9a6-24e27e1841cc/a0afa139-8dbe-4692-b45b-1084131419e4/Y3zrjeS
Replit-Helium-Checkpoint-Created: true
</commit_message>
<xml_diff>
--- a/BKApay_Dossier_Presentation.docx
+++ b/BKApay_Dossier_Presentation.docx
@@ -4,7 +4,7 @@
   <w:body>
     <w:p>
       <w:pPr>
-        <w:spacing w:before="0" w:after="80"/>
+        <w:spacing w:before="0" w:after="200"/>
         <w:jc w:val="center"/>
       </w:pPr>
       <w:r>
@@ -18,7 +18,7 @@
     </w:p>
     <w:p>
       <w:pPr>
-        <w:spacing w:after="40"/>
+        <w:spacing w:before="0" w:after="80"/>
         <w:jc w:val="center"/>
       </w:pPr>
       <w:r>
@@ -31,7 +31,7 @@
     </w:p>
     <w:p>
       <w:pPr>
-        <w:spacing w:after="40"/>
+        <w:spacing w:after="60"/>
         <w:jc w:val="center"/>
       </w:pPr>
       <w:r>
@@ -410,7 +410,7 @@
           <w:color w:val="333333"/>
           <w:sz w:val="21"/>
         </w:rPr>
-        <w:t>BKApay centralise l'acces a tous ces operateurs via une API unique, des liens de paiement sans code, un tableau de bord marchand complet et un assistant IA (EMALI) pour piloter les transactions en langage naturel. Les frais de service sont adaptes par pays et par operateur pour rester competitifs sur chaque marche. La plateforme est deployee et fonctionnelle dans 17 pays depuis son lancement en novembre 2025, avec une stabilite technique confirmee sur six mois de production reelle.</w:t>
+        <w:t>BKApay centralise l'acces a tous ces operateurs via une API unique, des liens de paiement sans code, un tableau de bord marchand complet et un assistant IA (EMALI) pour piloter les transactions en langage naturel. Les frais de service sont adaptes par pays et par operateur pour rester competitifs sur chaque marche. La plateforme est deployee et fonctionnelle dans 17 pays depuis novembre 2025, avec une stabilite technique confirmee sur six mois de production reelle.</w:t>
       </w:r>
     </w:p>
     <w:p>
@@ -444,7 +444,7 @@
           <w:color w:val="333333"/>
           <w:sz w:val="21"/>
         </w:rPr>
-        <w:t>BKApay genere ses revenus via des frais de service appliques a chaque transaction. Ces frais varient selon le pays et l'operateur afin de s'adapter aux conditions locales. A titre d'exemple, les frais peuvent s'elever a 6 % sur les paiements entrants (depots) et 6 % sur les paiements sortants (retraits), soit 12 % preleves au total sur un cycle complet depot-retrait. Cette double facturation sur chaque sens du flux constitue le moteur principal de generation de revenus de la plateforme.</w:t>
+        <w:t>BKApay genere ses revenus via des frais de service appliques a chaque transaction. Ces frais varient selon le pays et l'operateur afin de s'adapter aux conditions locales. A titre d'exemple, les frais peuvent s'elever a 6 % sur les paiements entrants (depots) et 6 % sur les paiements sortants (retraits), soit 12 % preleves au total sur un cycle complet depot-retrait.</w:t>
       </w:r>
     </w:p>
     <w:tbl>
@@ -531,7 +531,7 @@
                 <w:color w:val="FFFFFF"/>
                 <w:sz w:val="19"/>
               </w:rPr>
-              <w:t>Frais (exemple indicatif)</w:t>
+              <w:t>Frais indicatifs</w:t>
             </w:r>
           </w:p>
         </w:tc>
@@ -726,7 +726,7 @@
                 <w:color w:val="333333"/>
                 <w:sz w:val="19"/>
               </w:rPr>
-              <w:t>Jusqu'a 12 % au total preleves</w:t>
+              <w:t>Jusqu'a 12 % au total</w:t>
             </w:r>
           </w:p>
         </w:tc>
@@ -804,7 +804,7 @@
     </w:p>
     <w:p>
       <w:pPr>
-        <w:spacing w:after="120"/>
+        <w:spacing w:after="80"/>
       </w:pPr>
       <w:r>
         <w:rPr>
@@ -838,7 +838,7 @@
           <w:color w:val="333333"/>
           <w:sz w:val="21"/>
         </w:rPr>
-        <w:t>Objectif immediat (dans les 30 prochains jours) : depasser 50 000 000 FCFA de commissions de frais de service sur le mois. Avec des frais appliques sur les flux entrants et sortants, cet objectif est atteignable a partir d'un volume mensuel de transactions bien en deca des capacites techniques de la plateforme. Il constitue le premier palier de rentabilite visible et reproductible sur l'ensemble des 17 pays couverts.</w:t>
+        <w:t>Objectif immediat (30 prochains jours) : depasser 50 000 000 FCFA de commissions de frais de service sur le mois. Avec des frais appliques sur les flux entrants et sortants, cet objectif est atteignable a partir d'un volume mensuel bien en deca des capacites techniques de la plateforme.</w:t>
       </w:r>
     </w:p>
     <w:p>
@@ -851,7 +851,7 @@
           <w:color w:val="333333"/>
           <w:sz w:val="21"/>
         </w:rPr>
-        <w:t>Objectif a moyen terme : faire croitre ces commissions de maniere significative en augmentant le volume par pays grace a l'alimentation des wallets operateurs, aux campagnes marketing ciblees et a l'acquisition de nouveaux marchands et integrateurs API.</w:t>
+        <w:t>Objectif a moyen terme : faire croitre ces commissions en augmentant le volume par pays grace a l'alimentation des wallets operateurs, aux campagnes marketing ciblees et a l'acquisition de nouveaux marchands et integrateurs API.</w:t>
       </w:r>
     </w:p>
     <w:p>
@@ -885,7 +885,7 @@
           <w:color w:val="333333"/>
           <w:sz w:val="21"/>
         </w:rPr>
-        <w:t>Six mois apres son lancement en novembre 2025, BKApay tourne en production sans interruption et sans anomalie technique majeure. L'ensemble des 17 pays est operationnel, les flux entrants et sortants fonctionnent correctement pour chaque operateur integre, et la plateforme a deja traite des transactions reelles avec des utilisateurs actifs.</w:t>
+        <w:t>Six mois apres son lancement en novembre 2025, BKApay tourne en production sans interruption et sans anomalie technique majeure. L'ensemble des 17 pays est operationnel avec des transactions reelles traitees quotidiennement.</w:t>
       </w:r>
     </w:p>
     <w:p>
@@ -1193,7 +1193,7 @@
                 <w:color w:val="333333"/>
                 <w:sz w:val="19"/>
               </w:rPr>
-              <w:t>Chaque pays necessite un solde disponible chez le provider local pour assurer des transactions instantanees. La liquidite est le premier levier de croissance du volume et donc des commissions.</w:t>
+              <w:t>Chaque pays necessite un solde disponible chez le provider local pour assurer des transactions instantanees. La liquidite est le premier levier de croissance.</w:t>
             </w:r>
           </w:p>
         </w:tc>
@@ -1258,7 +1258,7 @@
                 <w:color w:val="333333"/>
                 <w:sz w:val="19"/>
               </w:rPr>
-              <w:t>Campagnes ciblees dans les pays a fort potentiel (CI, CM, SN, CD, BJ). Partenariats avec des marchands e-commerce, des diaspora-services et des PME africaines.</w:t>
+              <w:t>Campagnes ciblees (CI, CM, SN, CD, BJ). Partenariats avec des marchands e-commerce et PME africaines.</w:t>
             </w:r>
           </w:p>
         </w:tc>
@@ -1323,7 +1323,7 @@
                 <w:color w:val="333333"/>
                 <w:sz w:val="19"/>
               </w:rPr>
-              <w:t>Renforcement des serveurs, monitoring temps reel, redondance des providers de paiement et extension de la couverture a de nouveaux pays.</w:t>
+              <w:t>Renforcement des serveurs, monitoring temps reel, redondance des providers et extension a de nouveaux pays.</w:t>
             </w:r>
           </w:p>
         </w:tc>
@@ -1393,7 +1393,7 @@
           <w:color w:val="333333"/>
           <w:sz w:val="21"/>
         </w:rPr>
-        <w:t>Six mois de production reelle sans incident majeur dans 17 pays. Ce n'est pas un prototype ni une demo — c'est une infrastructure qui fonctionne et qui a deja traite des transactions reelles.</w:t>
+        <w:t>Six mois de production reelle sans incident majeur dans 17 pays. Ce n'est pas un prototype ni une demo — c'est une infrastructure qui fonctionne avec de vraies transactions.</w:t>
       </w:r>
     </w:p>
     <w:p>
@@ -1413,7 +1413,7 @@
           <w:color w:val="333333"/>
           <w:sz w:val="21"/>
         </w:rPr>
-        <w:t>17 pays couverts et operationnels via une architecture modulaire permettant d'ajouter un nouveau pays rapidement.</w:t>
+        <w:t>17 pays couverts via une architecture modulaire permettant d'ajouter un nouveau pays rapidement.</w:t>
       </w:r>
     </w:p>
     <w:p>
@@ -1433,7 +1433,7 @@
           <w:color w:val="333333"/>
           <w:sz w:val="21"/>
         </w:rPr>
-        <w:t>Les frais de service sont configures par pays et par operateur, permettant d'optimiser la competitivite sur chaque territoire.</w:t>
+        <w:t>Configures par pays et par operateur, les frais optimisent la competitivite sur chaque territoire tout en preservant la rentabilite.</w:t>
       </w:r>
     </w:p>
     <w:p>
@@ -1453,7 +1453,7 @@
           <w:color w:val="333333"/>
           <w:sz w:val="21"/>
         </w:rPr>
-        <w:t>Les frais sont appliques a l'entree et a la sortie des fonds, maximisant le revenu par utilisateur actif.</w:t>
+        <w:t>Frais appliques a l'entree et a la sortie des fonds, maximisant le revenu par utilisateur actif.</w:t>
       </w:r>
     </w:p>
     <w:p>
@@ -1473,7 +1473,7 @@
           <w:color w:val="333333"/>
           <w:sz w:val="21"/>
         </w:rPr>
-        <w:t>L'API Business v2.0 abstrait completement le provider sous-jacent. Un developpeur integre une fois et accede a tous les pays couverts.</w:t>
+        <w:t>L'API Business v2.0 abstrait le provider sous-jacent. Un developpeur integre une fois et accede a tous les pays.</w:t>
       </w:r>
     </w:p>
     <w:p>
@@ -1493,7 +1493,7 @@
           <w:color w:val="333333"/>
           <w:sz w:val="21"/>
         </w:rPr>
-        <w:t>Un assistant conversationnel permet aux utilisateurs de realiser des transactions en langage naturel, reduisant la friction et elargissant l'audience.</w:t>
+        <w:t>Assistant conversationnel permettant aux utilisateurs de realiser des transactions en langage naturel.</w:t>
       </w:r>
     </w:p>
     <w:p>
@@ -1527,7 +1527,7 @@
           <w:color w:val="333333"/>
           <w:sz w:val="21"/>
         </w:rPr>
-        <w:t>BKApay est un projet a l'idee solide, au produit fonctionnel depuis six mois en production et a la traction reelle. Ce qui nous manque aujourd'hui n'est pas une preuve de concept — c'est une structuration rigoureuse du narratif investisseur, une modelisation financiere defendable face a des fonds ou des partenaires institutionnels, et un cadrage strategique sur les prochaines etapes de croissance.</w:t>
+        <w:t>BKApay est un projet a l'idee solide, au produit fonctionnel depuis six mois en production et a la traction reelle. Ce qui nous manque aujourd'hui n'est pas une preuve de concept — c'est une structuration rigoureuse du narratif investisseur, une modelisation financiere defendable et un cadrage strategique sur les prochaines etapes de croissance.</w:t>
       </w:r>
     </w:p>
     <w:p>

</xml_diff>